<commit_message>
fixed bug in hent_dodsaarsag_data
</commit_message>
<xml_diff>
--- a/holdundervisning/modul-3-opgaver.docx
+++ b/holdundervisning/modul-3-opgaver.docx
@@ -63,8 +63,8 @@
         <w:outlineLvl w:val="0"/>
         <w:rPr/>
       </w:pPr>
-      <w:bookmarkStart w:id="0" w:name="OrgXref.orga7fe699"/>
-      <w:bookmarkStart w:id="1" w:name="orga7fe699"/>
+      <w:bookmarkStart w:id="0" w:name="OrgXref.orgab89de2"/>
+      <w:bookmarkStart w:id="1" w:name="orgab89de2"/>
       <w:bookmarkEnd w:id="1"/>
       <w:r>
         <w:rPr/>
@@ -188,8 +188,8 @@
         <w:outlineLvl w:val="0"/>
         <w:rPr/>
       </w:pPr>
-      <w:bookmarkStart w:id="2" w:name="OrgXref.org38e34d5"/>
-      <w:bookmarkStart w:id="3" w:name="org38e34d5"/>
+      <w:bookmarkStart w:id="2" w:name="OrgXref.org5998187"/>
+      <w:bookmarkStart w:id="3" w:name="org5998187"/>
       <w:bookmarkEnd w:id="3"/>
       <w:r>
         <w:rPr/>
@@ -231,8 +231,8 @@
         <w:outlineLvl w:val="0"/>
         <w:rPr/>
       </w:pPr>
-      <w:bookmarkStart w:id="4" w:name="OrgXref.org0c748ab"/>
-      <w:bookmarkStart w:id="5" w:name="org0c748ab"/>
+      <w:bookmarkStart w:id="4" w:name="OrgXref.org960e1d8"/>
+      <w:bookmarkStart w:id="5" w:name="org960e1d8"/>
       <w:bookmarkEnd w:id="5"/>
       <w:r>
         <w:rPr/>
@@ -374,8 +374,8 @@
         <w:outlineLvl w:val="0"/>
         <w:rPr/>
       </w:pPr>
-      <w:bookmarkStart w:id="6" w:name="OrgXref.orgcffd3bc"/>
-      <w:bookmarkStart w:id="7" w:name="orgcffd3bc"/>
+      <w:bookmarkStart w:id="6" w:name="OrgXref.org71ee052"/>
+      <w:bookmarkStart w:id="7" w:name="org71ee052"/>
       <w:bookmarkEnd w:id="7"/>
       <w:r>
         <w:rPr/>
@@ -417,8 +417,8 @@
         <w:outlineLvl w:val="0"/>
         <w:rPr/>
       </w:pPr>
-      <w:bookmarkStart w:id="8" w:name="OrgXref.org396dbcf"/>
-      <w:bookmarkStart w:id="9" w:name="org396dbcf"/>
+      <w:bookmarkStart w:id="8" w:name="OrgXref.orgb60e7aa"/>
+      <w:bookmarkStart w:id="9" w:name="orgb60e7aa"/>
       <w:bookmarkEnd w:id="9"/>
       <w:r>
         <w:rPr/>
@@ -460,8 +460,8 @@
         <w:outlineLvl w:val="0"/>
         <w:rPr/>
       </w:pPr>
-      <w:bookmarkStart w:id="10" w:name="OrgXref.org06ff100"/>
-      <w:bookmarkStart w:id="11" w:name="org06ff100"/>
+      <w:bookmarkStart w:id="10" w:name="OrgXref.orgbdf7ebb"/>
+      <w:bookmarkStart w:id="11" w:name="orgbdf7ebb"/>
       <w:bookmarkEnd w:id="11"/>
       <w:r>
         <w:rPr/>
@@ -503,8 +503,8 @@
         <w:outlineLvl w:val="0"/>
         <w:rPr/>
       </w:pPr>
-      <w:bookmarkStart w:id="12" w:name="OrgXref.org036d5fa"/>
-      <w:bookmarkStart w:id="13" w:name="org036d5fa"/>
+      <w:bookmarkStart w:id="12" w:name="OrgXref.org2a05789"/>
+      <w:bookmarkStart w:id="13" w:name="org2a05789"/>
       <w:bookmarkEnd w:id="13"/>
       <w:r>
         <w:rPr/>
@@ -546,8 +546,8 @@
         <w:outlineLvl w:val="0"/>
         <w:rPr/>
       </w:pPr>
-      <w:bookmarkStart w:id="14" w:name="OrgXref.orgea8f49c"/>
-      <w:bookmarkStart w:id="15" w:name="orgea8f49c"/>
+      <w:bookmarkStart w:id="14" w:name="OrgXref.orgf5158bf"/>
+      <w:bookmarkStart w:id="15" w:name="orgf5158bf"/>
       <w:bookmarkEnd w:id="15"/>
       <w:r>
         <w:rPr/>
@@ -589,8 +589,8 @@
         <w:outlineLvl w:val="0"/>
         <w:rPr/>
       </w:pPr>
-      <w:bookmarkStart w:id="16" w:name="OrgXref.orgc63e0d1"/>
-      <w:bookmarkStart w:id="17" w:name="orgc63e0d1"/>
+      <w:bookmarkStart w:id="16" w:name="OrgXref.orgf8384a4"/>
+      <w:bookmarkStart w:id="17" w:name="orgf8384a4"/>
       <w:bookmarkEnd w:id="17"/>
       <w:r>
         <w:rPr/>
@@ -632,8 +632,8 @@
         <w:outlineLvl w:val="0"/>
         <w:rPr/>
       </w:pPr>
-      <w:bookmarkStart w:id="18" w:name="OrgXref.org367f4b5"/>
-      <w:bookmarkStart w:id="19" w:name="org367f4b5"/>
+      <w:bookmarkStart w:id="18" w:name="OrgXref.orgb1ef362"/>
+      <w:bookmarkStart w:id="19" w:name="orgb1ef362"/>
       <w:bookmarkEnd w:id="19"/>
       <w:r>
         <w:rPr/>
@@ -827,8 +827,8 @@
         <w:outlineLvl w:val="1"/>
         <w:rPr/>
       </w:pPr>
-      <w:bookmarkStart w:id="20" w:name="OrgXref.orgee5ea6e"/>
-      <w:bookmarkStart w:id="21" w:name="orgee5ea6e"/>
+      <w:bookmarkStart w:id="20" w:name="OrgXref.org8790d0a"/>
+      <w:bookmarkStart w:id="21" w:name="org8790d0a"/>
       <w:bookmarkEnd w:id="21"/>
       <w:r>
         <w:rPr/>
@@ -2421,8 +2421,8 @@
         <w:outlineLvl w:val="1"/>
         <w:rPr/>
       </w:pPr>
-      <w:bookmarkStart w:id="22" w:name="OrgXref.org6112efe"/>
-      <w:bookmarkStart w:id="23" w:name="org6112efe"/>
+      <w:bookmarkStart w:id="22" w:name="OrgXref.org5fb753b"/>
+      <w:bookmarkStart w:id="23" w:name="org5fb753b"/>
       <w:bookmarkEnd w:id="23"/>
       <w:r>
         <w:rPr/>
@@ -4002,8 +4002,8 @@
         <w:outlineLvl w:val="0"/>
         <w:rPr/>
       </w:pPr>
-      <w:bookmarkStart w:id="24" w:name="OrgXref.org1a6e5fb"/>
-      <w:bookmarkStart w:id="25" w:name="org1a6e5fb"/>
+      <w:bookmarkStart w:id="24" w:name="OrgXref.orgb897494"/>
+      <w:bookmarkStart w:id="25" w:name="orgb897494"/>
       <w:bookmarkEnd w:id="25"/>
       <w:r>
         <w:rPr/>
@@ -4045,8 +4045,8 @@
         <w:outlineLvl w:val="0"/>
         <w:rPr/>
       </w:pPr>
-      <w:bookmarkStart w:id="26" w:name="OrgXref.orgc2fce13"/>
-      <w:bookmarkStart w:id="27" w:name="orgc2fce13"/>
+      <w:bookmarkStart w:id="26" w:name="OrgXref.orgc6e58fc"/>
+      <w:bookmarkStart w:id="27" w:name="orgc6e58fc"/>
       <w:bookmarkEnd w:id="27"/>
       <w:r>
         <w:rPr/>
@@ -4088,8 +4088,8 @@
         <w:outlineLvl w:val="0"/>
         <w:rPr/>
       </w:pPr>
-      <w:bookmarkStart w:id="28" w:name="OrgXref.orgb676c93"/>
-      <w:bookmarkStart w:id="29" w:name="orgb676c93"/>
+      <w:bookmarkStart w:id="28" w:name="OrgXref.orgb05ea61"/>
+      <w:bookmarkStart w:id="29" w:name="orgb05ea61"/>
       <w:bookmarkEnd w:id="29"/>
       <w:r>
         <w:rPr/>
@@ -4131,8 +4131,8 @@
         <w:outlineLvl w:val="0"/>
         <w:rPr/>
       </w:pPr>
-      <w:bookmarkStart w:id="30" w:name="OrgXref.orgcb7a9a8"/>
-      <w:bookmarkStart w:id="31" w:name="orgcb7a9a8"/>
+      <w:bookmarkStart w:id="30" w:name="OrgXref.orgb446348"/>
+      <w:bookmarkStart w:id="31" w:name="orgb446348"/>
       <w:bookmarkEnd w:id="31"/>
       <w:r>
         <w:rPr/>
@@ -4174,8 +4174,8 @@
         <w:outlineLvl w:val="0"/>
         <w:rPr/>
       </w:pPr>
-      <w:bookmarkStart w:id="32" w:name="OrgXref.org6cd4474"/>
-      <w:bookmarkStart w:id="33" w:name="org6cd4474"/>
+      <w:bookmarkStart w:id="32" w:name="OrgXref.org06bf31c"/>
+      <w:bookmarkStart w:id="33" w:name="org06bf31c"/>
       <w:bookmarkEnd w:id="33"/>
       <w:r>
         <w:rPr/>
@@ -4204,8 +4204,8 @@
         <w:outlineLvl w:val="1"/>
         <w:rPr/>
       </w:pPr>
-      <w:bookmarkStart w:id="34" w:name="OrgXref.orga08112b"/>
-      <w:bookmarkStart w:id="35" w:name="orga08112b"/>
+      <w:bookmarkStart w:id="34" w:name="OrgXref.org818f72a"/>
+      <w:bookmarkStart w:id="35" w:name="org818f72a"/>
       <w:bookmarkEnd w:id="35"/>
       <w:r>
         <w:rPr/>
@@ -4247,8 +4247,8 @@
         <w:outlineLvl w:val="0"/>
         <w:rPr/>
       </w:pPr>
-      <w:bookmarkStart w:id="36" w:name="OrgXref.orgc363b76"/>
-      <w:bookmarkStart w:id="37" w:name="orgc363b76"/>
+      <w:bookmarkStart w:id="36" w:name="OrgXref.org83701ec"/>
+      <w:bookmarkStart w:id="37" w:name="org83701ec"/>
       <w:bookmarkEnd w:id="37"/>
       <w:r>
         <w:rPr/>
@@ -4277,14 +4277,337 @@
         <w:outlineLvl w:val="1"/>
         <w:rPr/>
       </w:pPr>
-      <w:bookmarkStart w:id="38" w:name="OrgXref.org5cf3d19"/>
-      <w:bookmarkStart w:id="39" w:name="org5cf3d19"/>
+      <w:bookmarkStart w:id="38" w:name="OrgXref.org2c46f89"/>
+      <w:bookmarkStart w:id="39" w:name="org2c46f89"/>
       <w:bookmarkEnd w:id="39"/>
       <w:r>
         <w:rPr/>
+        <w:t xml:space="preserve">Tabel 4 </w:t>
+      </w:r>
+      <w:bookmarkEnd w:id="38"/>
+    </w:p>
+    <w:p>
+      <w:pPr>
+        <w:sectPr>
+          <w:type w:val="continuous"/>
+          <w:pgSz w:w="11906" w:h="16838"/>
+          <w:pgMar w:left="1134" w:right="1134" w:gutter="0" w:header="0" w:top="1134" w:footer="1134" w:bottom="1860"/>
+          <w:pgNumType w:fmt="decimal"/>
+          <w:formProt w:val="false"/>
+          <w:textDirection w:val="lrTb"/>
+          <w:docGrid w:type="default" w:linePitch="600" w:charSpace="40960"/>
+        </w:sectPr>
+      </w:pPr>
+    </w:p>
+    <w:tbl>
+      <w:tblPr>
+        <w:tblW w:w="4800" w:type="pct"/>
+        <w:jc w:val="center"/>
+        <w:tblInd w:w="0" w:type="dxa"/>
+        <w:tblLayout w:type="fixed"/>
+        <w:tblCellMar>
+          <w:top w:w="90" w:type="dxa"/>
+          <w:left w:w="90" w:type="dxa"/>
+          <w:bottom w:w="90" w:type="dxa"/>
+          <w:right w:w="90" w:type="dxa"/>
+        </w:tblCellMar>
+      </w:tblPr>
+      <w:tblGrid>
+        <w:gridCol w:w="2313"/>
+        <w:gridCol w:w="2313"/>
+        <w:gridCol w:w="2313"/>
+        <w:gridCol w:w="2313"/>
+      </w:tblGrid>
+      <w:tr>
+        <w:trPr>
+          <w:tblHeader w:val="true"/>
+        </w:trPr>
+        <w:tc>
+          <w:tcPr>
+            <w:tcW w:w="2313" w:type="dxa"/>
+            <w:tcBorders>
+              <w:top w:val="single" w:sz="2" w:space="0" w:color="000000"/>
+              <w:bottom w:val="single" w:sz="2" w:space="0" w:color="000000"/>
+            </w:tcBorders>
+          </w:tcPr>
+          <w:p>
+            <w:pPr>
+              <w:pStyle w:val="OrgTableHeadingLeft"/>
+              <w:bidi w:val="0"/>
+              <w:spacing w:before="0" w:after="120"/>
+              <w:jc w:val="left"/>
+              <w:rPr/>
+            </w:pPr>
+            <w:r>
+              <w:rPr/>
+              <w:t>Køn</w:t>
+            </w:r>
+          </w:p>
+        </w:tc>
+        <w:tc>
+          <w:tcPr>
+            <w:tcW w:w="2313" w:type="dxa"/>
+            <w:tcBorders>
+              <w:top w:val="single" w:sz="2" w:space="0" w:color="000000"/>
+              <w:bottom w:val="single" w:sz="2" w:space="0" w:color="000000"/>
+            </w:tcBorders>
+          </w:tcPr>
+          <w:p>
+            <w:pPr>
+              <w:pStyle w:val="OrgTableHeadingLeft"/>
+              <w:bidi w:val="0"/>
+              <w:spacing w:before="0" w:after="120"/>
+              <w:jc w:val="left"/>
+              <w:rPr/>
+            </w:pPr>
+            <w:r>
+              <w:rPr/>
+              <w:t>Standardiserede mortalitetsrater på grund af psykiske lidelser</w:t>
+            </w:r>
+          </w:p>
+        </w:tc>
+        <w:tc>
+          <w:tcPr>
+            <w:tcW w:w="2313" w:type="dxa"/>
+            <w:tcBorders>
+              <w:top w:val="single" w:sz="2" w:space="0" w:color="000000"/>
+              <w:bottom w:val="single" w:sz="2" w:space="0" w:color="000000"/>
+            </w:tcBorders>
+          </w:tcPr>
+          <w:p>
+            <w:pPr>
+              <w:pStyle w:val="OrgTableHeadingLeft"/>
+              <w:bidi w:val="0"/>
+              <w:spacing w:before="0" w:after="120"/>
+              <w:jc w:val="left"/>
+              <w:rPr/>
+            </w:pPr>
+            <w:r>
+              <w:rPr/>
+              <w:t>Middelrestlevetid fra 70 år</w:t>
+            </w:r>
+          </w:p>
+        </w:tc>
+        <w:tc>
+          <w:tcPr>
+            <w:tcW w:w="2313" w:type="dxa"/>
+            <w:tcBorders>
+              <w:top w:val="single" w:sz="2" w:space="0" w:color="000000"/>
+              <w:bottom w:val="single" w:sz="2" w:space="0" w:color="000000"/>
+            </w:tcBorders>
+          </w:tcPr>
+          <w:p>
+            <w:pPr>
+              <w:pStyle w:val="OrgTableHeadingLeft"/>
+              <w:bidi w:val="0"/>
+              <w:spacing w:before="0" w:after="120"/>
+              <w:jc w:val="left"/>
+              <w:rPr/>
+            </w:pPr>
+            <w:r>
+              <w:rPr/>
+              <w:t>Restlivstidsrisiko for død af psykiske lidelser ved 70 år</w:t>
+            </w:r>
+          </w:p>
+        </w:tc>
+      </w:tr>
+      <w:tr>
+        <w:trPr/>
+        <w:tc>
+          <w:tcPr>
+            <w:tcW w:w="2313" w:type="dxa"/>
+            <w:tcBorders>
+              <w:top w:val="single" w:sz="2" w:space="0" w:color="000000"/>
+            </w:tcBorders>
+          </w:tcPr>
+          <w:p>
+            <w:pPr>
+              <w:pStyle w:val="OrgTableContentsLeft"/>
+              <w:bidi w:val="0"/>
+              <w:spacing w:before="0" w:after="120"/>
+              <w:jc w:val="left"/>
+              <w:rPr/>
+            </w:pPr>
+            <w:r>
+              <w:rPr/>
+              <w:t>Kvinder</w:t>
+            </w:r>
+          </w:p>
+        </w:tc>
+        <w:tc>
+          <w:tcPr>
+            <w:tcW w:w="2313" w:type="dxa"/>
+            <w:tcBorders>
+              <w:top w:val="single" w:sz="2" w:space="0" w:color="000000"/>
+            </w:tcBorders>
+          </w:tcPr>
+          <w:p>
+            <w:pPr>
+              <w:pStyle w:val="OrgTableContentsLeft"/>
+              <w:bidi w:val="0"/>
+              <w:spacing w:before="0" w:after="120"/>
+              <w:jc w:val="left"/>
+              <w:rPr/>
+            </w:pPr>
+            <w:r>
+              <w:rPr/>
+            </w:r>
+          </w:p>
+        </w:tc>
+        <w:tc>
+          <w:tcPr>
+            <w:tcW w:w="2313" w:type="dxa"/>
+            <w:tcBorders>
+              <w:top w:val="single" w:sz="2" w:space="0" w:color="000000"/>
+            </w:tcBorders>
+          </w:tcPr>
+          <w:p>
+            <w:pPr>
+              <w:pStyle w:val="OrgTableContentsLeft"/>
+              <w:bidi w:val="0"/>
+              <w:spacing w:before="0" w:after="120"/>
+              <w:jc w:val="left"/>
+              <w:rPr/>
+            </w:pPr>
+            <w:r>
+              <w:rPr/>
+            </w:r>
+          </w:p>
+        </w:tc>
+        <w:tc>
+          <w:tcPr>
+            <w:tcW w:w="2313" w:type="dxa"/>
+            <w:tcBorders>
+              <w:top w:val="single" w:sz="2" w:space="0" w:color="000000"/>
+            </w:tcBorders>
+          </w:tcPr>
+          <w:p>
+            <w:pPr>
+              <w:pStyle w:val="OrgTableContentsLeft"/>
+              <w:bidi w:val="0"/>
+              <w:spacing w:before="0" w:after="120"/>
+              <w:jc w:val="left"/>
+              <w:rPr/>
+            </w:pPr>
+            <w:r>
+              <w:rPr/>
+            </w:r>
+          </w:p>
+        </w:tc>
+      </w:tr>
+      <w:tr>
+        <w:trPr/>
+        <w:tc>
+          <w:tcPr>
+            <w:tcW w:w="2313" w:type="dxa"/>
+            <w:tcBorders>
+              <w:bottom w:val="single" w:sz="2" w:space="0" w:color="000000"/>
+            </w:tcBorders>
+          </w:tcPr>
+          <w:p>
+            <w:pPr>
+              <w:pStyle w:val="OrgTableContentsLeft"/>
+              <w:bidi w:val="0"/>
+              <w:spacing w:before="0" w:after="120"/>
+              <w:jc w:val="left"/>
+              <w:rPr/>
+            </w:pPr>
+            <w:r>
+              <w:rPr/>
+              <w:t>Mænd</w:t>
+            </w:r>
+          </w:p>
+        </w:tc>
+        <w:tc>
+          <w:tcPr>
+            <w:tcW w:w="2313" w:type="dxa"/>
+            <w:tcBorders>
+              <w:bottom w:val="single" w:sz="2" w:space="0" w:color="000000"/>
+            </w:tcBorders>
+          </w:tcPr>
+          <w:p>
+            <w:pPr>
+              <w:pStyle w:val="OrgTableContentsLeft"/>
+              <w:bidi w:val="0"/>
+              <w:spacing w:before="0" w:after="120"/>
+              <w:jc w:val="left"/>
+              <w:rPr/>
+            </w:pPr>
+            <w:r>
+              <w:rPr/>
+            </w:r>
+          </w:p>
+        </w:tc>
+        <w:tc>
+          <w:tcPr>
+            <w:tcW w:w="2313" w:type="dxa"/>
+            <w:tcBorders>
+              <w:bottom w:val="single" w:sz="2" w:space="0" w:color="000000"/>
+            </w:tcBorders>
+          </w:tcPr>
+          <w:p>
+            <w:pPr>
+              <w:pStyle w:val="OrgTableContentsLeft"/>
+              <w:bidi w:val="0"/>
+              <w:spacing w:before="0" w:after="120"/>
+              <w:jc w:val="left"/>
+              <w:rPr/>
+            </w:pPr>
+            <w:r>
+              <w:rPr/>
+            </w:r>
+          </w:p>
+        </w:tc>
+        <w:tc>
+          <w:tcPr>
+            <w:tcW w:w="2313" w:type="dxa"/>
+            <w:tcBorders>
+              <w:bottom w:val="single" w:sz="2" w:space="0" w:color="000000"/>
+            </w:tcBorders>
+          </w:tcPr>
+          <w:p>
+            <w:pPr>
+              <w:pStyle w:val="OrgTableContentsLeft"/>
+              <w:bidi w:val="0"/>
+              <w:spacing w:before="0" w:after="120"/>
+              <w:jc w:val="left"/>
+              <w:rPr/>
+            </w:pPr>
+            <w:r>
+              <w:rPr/>
+            </w:r>
+          </w:p>
+        </w:tc>
+      </w:tr>
+    </w:tbl>
+    <w:p>
+      <w:pPr>
+        <w:sectPr>
+          <w:type w:val="continuous"/>
+          <w:pgSz w:w="11906" w:h="16838"/>
+          <w:pgMar w:left="1134" w:right="1134" w:gutter="0" w:header="0" w:top="1134" w:footer="1134" w:bottom="1860"/>
+          <w:formProt w:val="false"/>
+          <w:textDirection w:val="lrTb"/>
+          <w:docGrid w:type="default" w:linePitch="600" w:charSpace="40960"/>
+        </w:sectPr>
+      </w:pPr>
+    </w:p>
+    <w:p>
+      <w:pPr>
+        <w:pStyle w:val="Heading202unnumbered"/>
+        <w:bidi w:val="0"/>
+        <w:jc w:val="left"/>
+        <w:outlineLvl w:val="1"/>
+        <w:rPr/>
+      </w:pPr>
+      <w:bookmarkStart w:id="40" w:name="OrgXref.org522e37b"/>
+      <w:bookmarkStart w:id="41" w:name="org522e37b"/>
+      <w:bookmarkEnd w:id="41"/>
+      <w:r>
+        <w:rPr/>
         <w:t xml:space="preserve">Dine svar til opgave 4 </w:t>
       </w:r>
-      <w:bookmarkEnd w:id="38"/>
+      <w:bookmarkEnd w:id="40"/>
     </w:p>
     <w:p>
       <w:pPr>

</xml_diff>

<commit_message>
fixed bug in hent-fertilitetsrate funktion
</commit_message>
<xml_diff>
--- a/holdundervisning/modul-3-opgaver.docx
+++ b/holdundervisning/modul-3-opgaver.docx
@@ -63,8 +63,8 @@
         <w:outlineLvl w:val="0"/>
         <w:rPr/>
       </w:pPr>
-      <w:bookmarkStart w:id="0" w:name="OrgXref.orgab89de2"/>
-      <w:bookmarkStart w:id="1" w:name="orgab89de2"/>
+      <w:bookmarkStart w:id="0" w:name="OrgXref.org0552b3c"/>
+      <w:bookmarkStart w:id="1" w:name="org0552b3c"/>
       <w:bookmarkEnd w:id="1"/>
       <w:r>
         <w:rPr/>
@@ -188,8 +188,8 @@
         <w:outlineLvl w:val="0"/>
         <w:rPr/>
       </w:pPr>
-      <w:bookmarkStart w:id="2" w:name="OrgXref.org5998187"/>
-      <w:bookmarkStart w:id="3" w:name="org5998187"/>
+      <w:bookmarkStart w:id="2" w:name="OrgXref.org2f90c8e"/>
+      <w:bookmarkStart w:id="3" w:name="org2f90c8e"/>
       <w:bookmarkEnd w:id="3"/>
       <w:r>
         <w:rPr/>
@@ -231,8 +231,8 @@
         <w:outlineLvl w:val="0"/>
         <w:rPr/>
       </w:pPr>
-      <w:bookmarkStart w:id="4" w:name="OrgXref.org960e1d8"/>
-      <w:bookmarkStart w:id="5" w:name="org960e1d8"/>
+      <w:bookmarkStart w:id="4" w:name="OrgXref.org277b44d"/>
+      <w:bookmarkStart w:id="5" w:name="org277b44d"/>
       <w:bookmarkEnd w:id="5"/>
       <w:r>
         <w:rPr/>
@@ -374,8 +374,8 @@
         <w:outlineLvl w:val="0"/>
         <w:rPr/>
       </w:pPr>
-      <w:bookmarkStart w:id="6" w:name="OrgXref.org71ee052"/>
-      <w:bookmarkStart w:id="7" w:name="org71ee052"/>
+      <w:bookmarkStart w:id="6" w:name="OrgXref.orgf99c4b7"/>
+      <w:bookmarkStart w:id="7" w:name="orgf99c4b7"/>
       <w:bookmarkEnd w:id="7"/>
       <w:r>
         <w:rPr/>
@@ -417,8 +417,8 @@
         <w:outlineLvl w:val="0"/>
         <w:rPr/>
       </w:pPr>
-      <w:bookmarkStart w:id="8" w:name="OrgXref.orgb60e7aa"/>
-      <w:bookmarkStart w:id="9" w:name="orgb60e7aa"/>
+      <w:bookmarkStart w:id="8" w:name="OrgXref.orgc463231"/>
+      <w:bookmarkStart w:id="9" w:name="orgc463231"/>
       <w:bookmarkEnd w:id="9"/>
       <w:r>
         <w:rPr/>
@@ -460,8 +460,8 @@
         <w:outlineLvl w:val="0"/>
         <w:rPr/>
       </w:pPr>
-      <w:bookmarkStart w:id="10" w:name="OrgXref.orgbdf7ebb"/>
-      <w:bookmarkStart w:id="11" w:name="orgbdf7ebb"/>
+      <w:bookmarkStart w:id="10" w:name="OrgXref.org833aebf"/>
+      <w:bookmarkStart w:id="11" w:name="org833aebf"/>
       <w:bookmarkEnd w:id="11"/>
       <w:r>
         <w:rPr/>
@@ -503,8 +503,8 @@
         <w:outlineLvl w:val="0"/>
         <w:rPr/>
       </w:pPr>
-      <w:bookmarkStart w:id="12" w:name="OrgXref.org2a05789"/>
-      <w:bookmarkStart w:id="13" w:name="org2a05789"/>
+      <w:bookmarkStart w:id="12" w:name="OrgXref.orga8da033"/>
+      <w:bookmarkStart w:id="13" w:name="orga8da033"/>
       <w:bookmarkEnd w:id="13"/>
       <w:r>
         <w:rPr/>
@@ -546,8 +546,8 @@
         <w:outlineLvl w:val="0"/>
         <w:rPr/>
       </w:pPr>
-      <w:bookmarkStart w:id="14" w:name="OrgXref.orgf5158bf"/>
-      <w:bookmarkStart w:id="15" w:name="orgf5158bf"/>
+      <w:bookmarkStart w:id="14" w:name="OrgXref.org2ed8edf"/>
+      <w:bookmarkStart w:id="15" w:name="org2ed8edf"/>
       <w:bookmarkEnd w:id="15"/>
       <w:r>
         <w:rPr/>
@@ -589,8 +589,8 @@
         <w:outlineLvl w:val="0"/>
         <w:rPr/>
       </w:pPr>
-      <w:bookmarkStart w:id="16" w:name="OrgXref.orgf8384a4"/>
-      <w:bookmarkStart w:id="17" w:name="orgf8384a4"/>
+      <w:bookmarkStart w:id="16" w:name="OrgXref.org8417d01"/>
+      <w:bookmarkStart w:id="17" w:name="org8417d01"/>
       <w:bookmarkEnd w:id="17"/>
       <w:r>
         <w:rPr/>
@@ -632,8 +632,8 @@
         <w:outlineLvl w:val="0"/>
         <w:rPr/>
       </w:pPr>
-      <w:bookmarkStart w:id="18" w:name="OrgXref.orgb1ef362"/>
-      <w:bookmarkStart w:id="19" w:name="orgb1ef362"/>
+      <w:bookmarkStart w:id="18" w:name="OrgXref.org584b89e"/>
+      <w:bookmarkStart w:id="19" w:name="org584b89e"/>
       <w:bookmarkEnd w:id="19"/>
       <w:r>
         <w:rPr/>
@@ -827,8 +827,8 @@
         <w:outlineLvl w:val="1"/>
         <w:rPr/>
       </w:pPr>
-      <w:bookmarkStart w:id="20" w:name="OrgXref.org8790d0a"/>
-      <w:bookmarkStart w:id="21" w:name="org8790d0a"/>
+      <w:bookmarkStart w:id="20" w:name="OrgXref.orgcf44c85"/>
+      <w:bookmarkStart w:id="21" w:name="orgcf44c85"/>
       <w:bookmarkEnd w:id="21"/>
       <w:r>
         <w:rPr/>
@@ -1027,7 +1027,7 @@
             </w:pPr>
             <w:r>
               <w:rPr/>
-              <w:t>0-1</w:t>
+              <w:t>0</w:t>
             </w:r>
           </w:p>
         </w:tc>
@@ -1048,7 +1048,7 @@
             </w:pPr>
             <w:r>
               <w:rPr/>
-              <w:t>8179</w:t>
+              <w:t>4386</w:t>
             </w:r>
           </w:p>
         </w:tc>
@@ -1151,7 +1151,7 @@
             </w:pPr>
             <w:r>
               <w:rPr/>
-              <w:t>2-5</w:t>
+              <w:t>1-9</w:t>
             </w:r>
           </w:p>
         </w:tc>
@@ -1170,7 +1170,7 @@
             </w:pPr>
             <w:r>
               <w:rPr/>
-              <w:t>13197</w:t>
+              <w:t>28289</w:t>
             </w:r>
           </w:p>
         </w:tc>
@@ -1265,7 +1265,7 @@
             </w:pPr>
             <w:r>
               <w:rPr/>
-              <w:t>6-15</w:t>
+              <w:t>10-19</w:t>
             </w:r>
           </w:p>
         </w:tc>
@@ -1284,7 +1284,7 @@
             </w:pPr>
             <w:r>
               <w:rPr/>
-              <w:t>27273</w:t>
+              <w:t>27138</w:t>
             </w:r>
           </w:p>
         </w:tc>
@@ -1303,7 +1303,7 @@
             </w:pPr>
             <w:r>
               <w:rPr/>
-              <w:t>2</w:t>
+              <w:t>4</w:t>
             </w:r>
           </w:p>
         </w:tc>
@@ -1379,7 +1379,7 @@
             </w:pPr>
             <w:r>
               <w:rPr/>
-              <w:t>16-25</w:t>
+              <w:t>20-29</w:t>
             </w:r>
           </w:p>
         </w:tc>
@@ -1398,7 +1398,7 @@
             </w:pPr>
             <w:r>
               <w:rPr/>
-              <w:t>54669</w:t>
+              <w:t>82149</w:t>
             </w:r>
           </w:p>
         </w:tc>
@@ -1417,7 +1417,7 @@
             </w:pPr>
             <w:r>
               <w:rPr/>
-              <w:t>11</w:t>
+              <w:t>15</w:t>
             </w:r>
           </w:p>
         </w:tc>
@@ -1493,7 +1493,7 @@
             </w:pPr>
             <w:r>
               <w:rPr/>
-              <w:t>26-35</w:t>
+              <w:t>30-39</w:t>
             </w:r>
           </w:p>
         </w:tc>
@@ -1512,7 +1512,7 @@
             </w:pPr>
             <w:r>
               <w:rPr/>
-              <w:t>84415</w:t>
+              <w:t>66586</w:t>
             </w:r>
           </w:p>
         </w:tc>
@@ -1531,7 +1531,7 @@
             </w:pPr>
             <w:r>
               <w:rPr/>
-              <w:t>14</w:t>
+              <w:t>17</w:t>
             </w:r>
           </w:p>
         </w:tc>
@@ -1607,7 +1607,7 @@
             </w:pPr>
             <w:r>
               <w:rPr/>
-              <w:t>36-45</w:t>
+              <w:t>40-49</w:t>
             </w:r>
           </w:p>
         </w:tc>
@@ -1626,7 +1626,7 @@
             </w:pPr>
             <w:r>
               <w:rPr/>
-              <w:t>45331</w:t>
+              <w:t>39950</w:t>
             </w:r>
           </w:p>
         </w:tc>
@@ -1645,7 +1645,7 @@
             </w:pPr>
             <w:r>
               <w:rPr/>
-              <w:t>19</w:t>
+              <w:t>29</w:t>
             </w:r>
           </w:p>
         </w:tc>
@@ -1721,7 +1721,7 @@
             </w:pPr>
             <w:r>
               <w:rPr/>
-              <w:t>46-55</w:t>
+              <w:t>50-59</w:t>
             </w:r>
           </w:p>
         </w:tc>
@@ -1740,7 +1740,7 @@
             </w:pPr>
             <w:r>
               <w:rPr/>
-              <w:t>37892</w:t>
+              <w:t>36012</w:t>
             </w:r>
           </w:p>
         </w:tc>
@@ -1759,7 +1759,7 @@
             </w:pPr>
             <w:r>
               <w:rPr/>
-              <w:t>55</w:t>
+              <w:t>64</w:t>
             </w:r>
           </w:p>
         </w:tc>
@@ -1835,7 +1835,7 @@
             </w:pPr>
             <w:r>
               <w:rPr/>
-              <w:t>56-65</w:t>
+              <w:t>60-69</w:t>
             </w:r>
           </w:p>
         </w:tc>
@@ -1854,7 +1854,7 @@
             </w:pPr>
             <w:r>
               <w:rPr/>
-              <w:t>30306</w:t>
+              <w:t>25492</w:t>
             </w:r>
           </w:p>
         </w:tc>
@@ -1873,7 +1873,7 @@
             </w:pPr>
             <w:r>
               <w:rPr/>
-              <w:t>130</w:t>
+              <w:t>177</w:t>
             </w:r>
           </w:p>
         </w:tc>
@@ -1949,7 +1949,7 @@
             </w:pPr>
             <w:r>
               <w:rPr/>
-              <w:t>66-75</w:t>
+              <w:t>70-79</w:t>
             </w:r>
           </w:p>
         </w:tc>
@@ -1968,7 +1968,7 @@
             </w:pPr>
             <w:r>
               <w:rPr/>
-              <w:t>20253</w:t>
+              <w:t>18477</w:t>
             </w:r>
           </w:p>
         </w:tc>
@@ -1987,7 +1987,7 @@
             </w:pPr>
             <w:r>
               <w:rPr/>
-              <w:t>282</w:t>
+              <w:t>423</w:t>
             </w:r>
           </w:p>
         </w:tc>
@@ -2063,7 +2063,7 @@
             </w:pPr>
             <w:r>
               <w:rPr/>
-              <w:t>76-85</w:t>
+              <w:t>80-89</w:t>
             </w:r>
           </w:p>
         </w:tc>
@@ -2082,7 +2082,7 @@
             </w:pPr>
             <w:r>
               <w:rPr/>
-              <w:t>13637</w:t>
+              <w:t>8841</w:t>
             </w:r>
           </w:p>
         </w:tc>
@@ -2101,7 +2101,7 @@
             </w:pPr>
             <w:r>
               <w:rPr/>
-              <w:t>567</w:t>
+              <w:t>586</w:t>
             </w:r>
           </w:p>
         </w:tc>
@@ -2165,120 +2165,6 @@
         <w:tc>
           <w:tcPr>
             <w:tcW w:w="1542" w:type="dxa"/>
-            <w:tcBorders/>
-          </w:tcPr>
-          <w:p>
-            <w:pPr>
-              <w:pStyle w:val="OrgTableContentsRight"/>
-              <w:bidi w:val="0"/>
-              <w:spacing w:before="0" w:after="120"/>
-              <w:jc w:val="right"/>
-              <w:rPr/>
-            </w:pPr>
-            <w:r>
-              <w:rPr/>
-              <w:t>86-95</w:t>
-            </w:r>
-          </w:p>
-        </w:tc>
-        <w:tc>
-          <w:tcPr>
-            <w:tcW w:w="1542" w:type="dxa"/>
-            <w:tcBorders/>
-          </w:tcPr>
-          <w:p>
-            <w:pPr>
-              <w:pStyle w:val="OrgTableContentsRight"/>
-              <w:bidi w:val="0"/>
-              <w:spacing w:before="0" w:after="120"/>
-              <w:jc w:val="right"/>
-              <w:rPr/>
-            </w:pPr>
-            <w:r>
-              <w:rPr/>
-              <w:t>3526</w:t>
-            </w:r>
-          </w:p>
-        </w:tc>
-        <w:tc>
-          <w:tcPr>
-            <w:tcW w:w="1542" w:type="dxa"/>
-            <w:tcBorders/>
-          </w:tcPr>
-          <w:p>
-            <w:pPr>
-              <w:pStyle w:val="OrgTableContentsRight"/>
-              <w:bidi w:val="0"/>
-              <w:spacing w:before="0" w:after="120"/>
-              <w:jc w:val="right"/>
-              <w:rPr/>
-            </w:pPr>
-            <w:r>
-              <w:rPr/>
-              <w:t>488</w:t>
-            </w:r>
-          </w:p>
-        </w:tc>
-        <w:tc>
-          <w:tcPr>
-            <w:tcW w:w="1542" w:type="dxa"/>
-            <w:tcBorders/>
-          </w:tcPr>
-          <w:p>
-            <w:pPr>
-              <w:pStyle w:val="OrgTableContentsLeft"/>
-              <w:bidi w:val="0"/>
-              <w:spacing w:before="0" w:after="120"/>
-              <w:jc w:val="left"/>
-              <w:rPr/>
-            </w:pPr>
-            <w:r>
-              <w:rPr/>
-            </w:r>
-          </w:p>
-        </w:tc>
-        <w:tc>
-          <w:tcPr>
-            <w:tcW w:w="1542" w:type="dxa"/>
-            <w:tcBorders/>
-          </w:tcPr>
-          <w:p>
-            <w:pPr>
-              <w:pStyle w:val="OrgTableContentsLeft"/>
-              <w:bidi w:val="0"/>
-              <w:spacing w:before="0" w:after="120"/>
-              <w:jc w:val="left"/>
-              <w:rPr/>
-            </w:pPr>
-            <w:r>
-              <w:rPr/>
-            </w:r>
-          </w:p>
-        </w:tc>
-        <w:tc>
-          <w:tcPr>
-            <w:tcW w:w="1542" w:type="dxa"/>
-            <w:tcBorders/>
-          </w:tcPr>
-          <w:p>
-            <w:pPr>
-              <w:pStyle w:val="OrgTableContentsLeft"/>
-              <w:bidi w:val="0"/>
-              <w:spacing w:before="0" w:after="120"/>
-              <w:jc w:val="left"/>
-              <w:rPr/>
-            </w:pPr>
-            <w:r>
-              <w:rPr/>
-            </w:r>
-          </w:p>
-        </w:tc>
-      </w:tr>
-      <w:tr>
-        <w:trPr/>
-        <w:tc>
-          <w:tcPr>
-            <w:tcW w:w="1542" w:type="dxa"/>
             <w:tcBorders>
               <w:bottom w:val="single" w:sz="2" w:space="0" w:color="000000"/>
             </w:tcBorders>
@@ -2293,7 +2179,7 @@
             </w:pPr>
             <w:r>
               <w:rPr/>
-              <w:t>&gt;95</w:t>
+              <w:t>90+</w:t>
             </w:r>
           </w:p>
         </w:tc>
@@ -2314,7 +2200,7 @@
             </w:pPr>
             <w:r>
               <w:rPr/>
-              <w:t>335</w:t>
+              <w:t>1693</w:t>
             </w:r>
           </w:p>
         </w:tc>
@@ -2335,7 +2221,7 @@
             </w:pPr>
             <w:r>
               <w:rPr/>
-              <w:t>136</w:t>
+              <w:t>389</w:t>
             </w:r>
           </w:p>
         </w:tc>
@@ -2421,8 +2307,8 @@
         <w:outlineLvl w:val="1"/>
         <w:rPr/>
       </w:pPr>
-      <w:bookmarkStart w:id="22" w:name="OrgXref.org5fb753b"/>
-      <w:bookmarkStart w:id="23" w:name="org5fb753b"/>
+      <w:bookmarkStart w:id="22" w:name="OrgXref.org62b4ff1"/>
+      <w:bookmarkStart w:id="23" w:name="org62b4ff1"/>
       <w:bookmarkEnd w:id="23"/>
       <w:r>
         <w:rPr/>
@@ -2620,7 +2506,7 @@
             </w:pPr>
             <w:r>
               <w:rPr/>
-              <w:t>0-1</w:t>
+              <w:t>0</w:t>
             </w:r>
           </w:p>
         </w:tc>
@@ -2743,7 +2629,7 @@
             </w:pPr>
             <w:r>
               <w:rPr/>
-              <w:t>2-5</w:t>
+              <w:t>1-9</w:t>
             </w:r>
           </w:p>
         </w:tc>
@@ -2762,7 +2648,7 @@
             </w:pPr>
             <w:r>
               <w:rPr/>
-              <w:t>100000</w:t>
+              <w:t>99614</w:t>
             </w:r>
           </w:p>
         </w:tc>
@@ -2856,7 +2742,7 @@
             </w:pPr>
             <w:r>
               <w:rPr/>
-              <w:t>6-15</w:t>
+              <w:t>10-19</w:t>
             </w:r>
           </w:p>
         </w:tc>
@@ -2875,7 +2761,7 @@
             </w:pPr>
             <w:r>
               <w:rPr/>
-              <w:t>100000</w:t>
+              <w:t>99614</w:t>
             </w:r>
           </w:p>
         </w:tc>
@@ -2969,7 +2855,7 @@
             </w:pPr>
             <w:r>
               <w:rPr/>
-              <w:t>16-25</w:t>
+              <w:t>20-29</w:t>
             </w:r>
           </w:p>
         </w:tc>
@@ -2988,7 +2874,7 @@
             </w:pPr>
             <w:r>
               <w:rPr/>
-              <w:t>100000</w:t>
+              <w:t>99467</w:t>
             </w:r>
           </w:p>
         </w:tc>
@@ -3082,7 +2968,7 @@
             </w:pPr>
             <w:r>
               <w:rPr/>
-              <w:t>26-35</w:t>
+              <w:t>30-39</w:t>
             </w:r>
           </w:p>
         </w:tc>
@@ -3101,7 +2987,7 @@
             </w:pPr>
             <w:r>
               <w:rPr/>
-              <w:t>100000</w:t>
+              <w:t>99286</w:t>
             </w:r>
           </w:p>
         </w:tc>
@@ -3195,7 +3081,7 @@
             </w:pPr>
             <w:r>
               <w:rPr/>
-              <w:t>36-45</w:t>
+              <w:t>40-49</w:t>
             </w:r>
           </w:p>
         </w:tc>
@@ -3214,7 +3100,7 @@
             </w:pPr>
             <w:r>
               <w:rPr/>
-              <w:t>100000</w:t>
+              <w:t>99033</w:t>
             </w:r>
           </w:p>
         </w:tc>
@@ -3308,7 +3194,7 @@
             </w:pPr>
             <w:r>
               <w:rPr/>
-              <w:t>46-55</w:t>
+              <w:t>50-59</w:t>
             </w:r>
           </w:p>
         </w:tc>
@@ -3327,7 +3213,7 @@
             </w:pPr>
             <w:r>
               <w:rPr/>
-              <w:t>98868</w:t>
+              <w:t>98319</w:t>
             </w:r>
           </w:p>
         </w:tc>
@@ -3421,7 +3307,7 @@
             </w:pPr>
             <w:r>
               <w:rPr/>
-              <w:t>56-65</w:t>
+              <w:t>60-69</w:t>
             </w:r>
           </w:p>
         </w:tc>
@@ -3440,7 +3326,7 @@
             </w:pPr>
             <w:r>
               <w:rPr/>
-              <w:t>98868</w:t>
+              <w:t>96601</w:t>
             </w:r>
           </w:p>
         </w:tc>
@@ -3534,7 +3420,7 @@
             </w:pPr>
             <w:r>
               <w:rPr/>
-              <w:t>66-75</w:t>
+              <w:t>70-79</w:t>
             </w:r>
           </w:p>
         </w:tc>
@@ -3553,7 +3439,7 @@
             </w:pPr>
             <w:r>
               <w:rPr/>
-              <w:t>95821</w:t>
+              <w:t>90308</w:t>
             </w:r>
           </w:p>
         </w:tc>
@@ -3647,7 +3533,7 @@
             </w:pPr>
             <w:r>
               <w:rPr/>
-              <w:t>76-85</w:t>
+              <w:t>80-89</w:t>
             </w:r>
           </w:p>
         </w:tc>
@@ -3666,7 +3552,7 @@
             </w:pPr>
             <w:r>
               <w:rPr/>
-              <w:t>86664</w:t>
+              <w:t>73327</w:t>
             </w:r>
           </w:p>
         </w:tc>
@@ -3748,119 +3634,6 @@
         <w:tc>
           <w:tcPr>
             <w:tcW w:w="1542" w:type="dxa"/>
-            <w:tcBorders/>
-          </w:tcPr>
-          <w:p>
-            <w:pPr>
-              <w:pStyle w:val="OrgTableContentsRight"/>
-              <w:bidi w:val="0"/>
-              <w:spacing w:before="0" w:after="120"/>
-              <w:jc w:val="right"/>
-              <w:rPr/>
-            </w:pPr>
-            <w:r>
-              <w:rPr/>
-              <w:t>86-95</w:t>
-            </w:r>
-          </w:p>
-        </w:tc>
-        <w:tc>
-          <w:tcPr>
-            <w:tcW w:w="1542" w:type="dxa"/>
-            <w:tcBorders/>
-          </w:tcPr>
-          <w:p>
-            <w:pPr>
-              <w:pStyle w:val="OrgTableContentsRight"/>
-              <w:bidi w:val="0"/>
-              <w:spacing w:before="0" w:after="120"/>
-              <w:jc w:val="right"/>
-              <w:rPr/>
-            </w:pPr>
-            <w:r>
-              <w:rPr/>
-              <w:t>67165</w:t>
-            </w:r>
-          </w:p>
-        </w:tc>
-        <w:tc>
-          <w:tcPr>
-            <w:tcW w:w="1542" w:type="dxa"/>
-            <w:tcBorders/>
-          </w:tcPr>
-          <w:p>
-            <w:pPr>
-              <w:pStyle w:val="OrgTableContentsLeft"/>
-              <w:bidi w:val="0"/>
-              <w:spacing w:before="0" w:after="120"/>
-              <w:jc w:val="left"/>
-              <w:rPr/>
-            </w:pPr>
-            <w:r>
-              <w:rPr/>
-            </w:r>
-          </w:p>
-        </w:tc>
-        <w:tc>
-          <w:tcPr>
-            <w:tcW w:w="1542" w:type="dxa"/>
-            <w:tcBorders/>
-          </w:tcPr>
-          <w:p>
-            <w:pPr>
-              <w:pStyle w:val="OrgTableContentsLeft"/>
-              <w:bidi w:val="0"/>
-              <w:spacing w:before="0" w:after="120"/>
-              <w:jc w:val="left"/>
-              <w:rPr/>
-            </w:pPr>
-            <w:r>
-              <w:rPr/>
-            </w:r>
-          </w:p>
-        </w:tc>
-        <w:tc>
-          <w:tcPr>
-            <w:tcW w:w="1542" w:type="dxa"/>
-            <w:tcBorders/>
-          </w:tcPr>
-          <w:p>
-            <w:pPr>
-              <w:pStyle w:val="OrgTableContentsLeft"/>
-              <w:bidi w:val="0"/>
-              <w:spacing w:before="0" w:after="120"/>
-              <w:jc w:val="left"/>
-              <w:rPr/>
-            </w:pPr>
-            <w:r>
-              <w:rPr/>
-            </w:r>
-          </w:p>
-        </w:tc>
-        <w:tc>
-          <w:tcPr>
-            <w:tcW w:w="1542" w:type="dxa"/>
-            <w:tcBorders/>
-          </w:tcPr>
-          <w:p>
-            <w:pPr>
-              <w:pStyle w:val="OrgTableContentsLeft"/>
-              <w:bidi w:val="0"/>
-              <w:spacing w:before="0" w:after="120"/>
-              <w:jc w:val="left"/>
-              <w:rPr/>
-            </w:pPr>
-            <w:r>
-              <w:rPr/>
-            </w:r>
-          </w:p>
-        </w:tc>
-      </w:tr>
-      <w:tr>
-        <w:trPr/>
-        <w:tc>
-          <w:tcPr>
-            <w:tcW w:w="1542" w:type="dxa"/>
             <w:tcBorders>
               <w:bottom w:val="single" w:sz="2" w:space="0" w:color="000000"/>
             </w:tcBorders>
@@ -3875,7 +3648,7 @@
             </w:pPr>
             <w:r>
               <w:rPr/>
-              <w:t>&gt;95</w:t>
+              <w:t>90+</w:t>
             </w:r>
           </w:p>
         </w:tc>
@@ -3896,7 +3669,7 @@
             </w:pPr>
             <w:r>
               <w:rPr/>
-              <w:t>31086</w:t>
+              <w:t>43504</w:t>
             </w:r>
           </w:p>
         </w:tc>
@@ -4002,8 +3775,8 @@
         <w:outlineLvl w:val="0"/>
         <w:rPr/>
       </w:pPr>
-      <w:bookmarkStart w:id="24" w:name="OrgXref.orgb897494"/>
-      <w:bookmarkStart w:id="25" w:name="orgb897494"/>
+      <w:bookmarkStart w:id="24" w:name="OrgXref.org50353a4"/>
+      <w:bookmarkStart w:id="25" w:name="org50353a4"/>
       <w:bookmarkEnd w:id="25"/>
       <w:r>
         <w:rPr/>
@@ -4045,8 +3818,8 @@
         <w:outlineLvl w:val="0"/>
         <w:rPr/>
       </w:pPr>
-      <w:bookmarkStart w:id="26" w:name="OrgXref.orgc6e58fc"/>
-      <w:bookmarkStart w:id="27" w:name="orgc6e58fc"/>
+      <w:bookmarkStart w:id="26" w:name="OrgXref.orgdb37bbc"/>
+      <w:bookmarkStart w:id="27" w:name="orgdb37bbc"/>
       <w:bookmarkEnd w:id="27"/>
       <w:r>
         <w:rPr/>
@@ -4088,8 +3861,8 @@
         <w:outlineLvl w:val="0"/>
         <w:rPr/>
       </w:pPr>
-      <w:bookmarkStart w:id="28" w:name="OrgXref.orgb05ea61"/>
-      <w:bookmarkStart w:id="29" w:name="orgb05ea61"/>
+      <w:bookmarkStart w:id="28" w:name="OrgXref.orgfcc1dac"/>
+      <w:bookmarkStart w:id="29" w:name="orgfcc1dac"/>
       <w:bookmarkEnd w:id="29"/>
       <w:r>
         <w:rPr/>
@@ -4131,8 +3904,8 @@
         <w:outlineLvl w:val="0"/>
         <w:rPr/>
       </w:pPr>
-      <w:bookmarkStart w:id="30" w:name="OrgXref.orgb446348"/>
-      <w:bookmarkStart w:id="31" w:name="orgb446348"/>
+      <w:bookmarkStart w:id="30" w:name="OrgXref.orgefdb40b"/>
+      <w:bookmarkStart w:id="31" w:name="orgefdb40b"/>
       <w:bookmarkEnd w:id="31"/>
       <w:r>
         <w:rPr/>
@@ -4174,8 +3947,8 @@
         <w:outlineLvl w:val="0"/>
         <w:rPr/>
       </w:pPr>
-      <w:bookmarkStart w:id="32" w:name="OrgXref.org06bf31c"/>
-      <w:bookmarkStart w:id="33" w:name="org06bf31c"/>
+      <w:bookmarkStart w:id="32" w:name="OrgXref.orgdc0e326"/>
+      <w:bookmarkStart w:id="33" w:name="orgdc0e326"/>
       <w:bookmarkEnd w:id="33"/>
       <w:r>
         <w:rPr/>
@@ -4204,8 +3977,8 @@
         <w:outlineLvl w:val="1"/>
         <w:rPr/>
       </w:pPr>
-      <w:bookmarkStart w:id="34" w:name="OrgXref.org818f72a"/>
-      <w:bookmarkStart w:id="35" w:name="org818f72a"/>
+      <w:bookmarkStart w:id="34" w:name="OrgXref.orgb980919"/>
+      <w:bookmarkStart w:id="35" w:name="orgb980919"/>
       <w:bookmarkEnd w:id="35"/>
       <w:r>
         <w:rPr/>
@@ -4247,8 +4020,8 @@
         <w:outlineLvl w:val="0"/>
         <w:rPr/>
       </w:pPr>
-      <w:bookmarkStart w:id="36" w:name="OrgXref.org83701ec"/>
-      <w:bookmarkStart w:id="37" w:name="org83701ec"/>
+      <w:bookmarkStart w:id="36" w:name="OrgXref.org7d8285b"/>
+      <w:bookmarkStart w:id="37" w:name="org7d8285b"/>
       <w:bookmarkEnd w:id="37"/>
       <w:r>
         <w:rPr/>
@@ -4277,8 +4050,8 @@
         <w:outlineLvl w:val="1"/>
         <w:rPr/>
       </w:pPr>
-      <w:bookmarkStart w:id="38" w:name="OrgXref.org2c46f89"/>
-      <w:bookmarkStart w:id="39" w:name="org2c46f89"/>
+      <w:bookmarkStart w:id="38" w:name="OrgXref.orgdbecf12"/>
+      <w:bookmarkStart w:id="39" w:name="orgdbecf12"/>
       <w:bookmarkEnd w:id="39"/>
       <w:r>
         <w:rPr/>
@@ -4600,8 +4373,8 @@
         <w:outlineLvl w:val="1"/>
         <w:rPr/>
       </w:pPr>
-      <w:bookmarkStart w:id="40" w:name="OrgXref.org522e37b"/>
-      <w:bookmarkStart w:id="41" w:name="org522e37b"/>
+      <w:bookmarkStart w:id="40" w:name="OrgXref.org101149f"/>
+      <w:bookmarkStart w:id="41" w:name="org101149f"/>
       <w:bookmarkEnd w:id="41"/>
       <w:r>
         <w:rPr/>

</xml_diff>